<commit_message>
Atualiza documento da prova GS com nova versão
</commit_message>
<xml_diff>
--- a/printgitGS.docx
+++ b/printgitGS.docx
@@ -343,6 +343,11 @@
             </a:graphic>
           </wp:inline>
         </w:drawing>
+      </w:r>
+    </w:p>
+    <w:p>
+      <w:r>
+        <w:t>https://github.com/Humberto-gfs/gsgovernanca</w:t>
       </w:r>
     </w:p>
     <w:sectPr>

</xml_diff>